<commit_message>
docs: updated data dictionary, table PRODUCT, column prd_nome, added UNIQUE constraint
</commit_message>
<xml_diff>
--- a/docs/data-dictionary/data-dictionary.docx
+++ b/docs/data-dictionary/data-dictionary.docx
@@ -2810,6 +2810,12 @@
                 <w:rFonts w:ascii="Arial" w:hAnsi="Arial" w:cs="Arial"/>
               </w:rPr>
             </w:pPr>
+            <w:r>
+              <w:rPr>
+                <w:rFonts w:ascii="Arial" w:hAnsi="Arial" w:cs="Arial"/>
+              </w:rPr>
+              <w:t xml:space="preserve">UNIQUE, </w:t>
+            </w:r>
             <w:r>
               <w:rPr>
                 <w:rFonts w:ascii="Arial" w:hAnsi="Arial" w:cs="Arial"/>

</xml_diff>